<commit_message>
Use DepEd MATATAG Math CG as source of truth for Grade 7 Term 1 CM
- Move uploaded CG PDF to sources/deped and add a text extract
- Replace NCTM process standards with the CG's strands of mathematical proficiency
- Match competency A7 to the CG wording; cite the CG in the CM note

Co-Authored-By: Claude Opus 5.5 <noreply@anthropic.com>
Claude-Session: https://claude.ai/code/session_017G5QYgrCTCFugkQCNFUaXc
</commit_message>
<xml_diff>
--- a/output/grade7/Grade7-CM-1st_Trim-SY2026-2027-Mathematics.docx
+++ b/output/grade7/Grade7-CM-1st_Trim-SY2026-2027-Mathematics.docx
@@ -79,7 +79,7 @@
           <w:color w:val="595959"/>
           <w:sz w:val="16"/>
         </w:rPr>
-        <w:t>Aligned with the DepEd MATATAG Grade 7 Mathematics Three-Term Budget of Work for Learning Competencies (First Term). Competencies marked ★ are DepEd learning competencies quoted verbatim.</w:t>
+        <w:t>Aligned with the DepEd MATATAG Mathematics Curriculum Guide (Grade 7, Quarter 1 and Quarter 2 items 1–2) as sequenced in the DepEd Three-Term Budget of Work (First Term). Competencies marked ★ are DepEd learning competencies quoted verbatim.</w:t>
       </w:r>
     </w:p>
     <w:tbl>
@@ -556,7 +556,7 @@
                 <w:i w:val="0"/>
                 <w:sz w:val="20"/>
               </w:rPr>
-              <w:t>NCTM Process Standards:</w:t>
+              <w:t>Strands of Mathematical Proficiency (MATATAG Mathematics Curriculum Framework, from NRC 2001):</w:t>
             </w:r>
           </w:p>
           <w:p>
@@ -570,7 +570,7 @@
                 <w:i w:val="0"/>
                 <w:sz w:val="20"/>
               </w:rPr>
-              <w:t>Problem Solving</w:t>
+              <w:t>Conceptual Understanding</w:t>
             </w:r>
           </w:p>
           <w:p>
@@ -598,7 +598,7 @@
                 <w:i/>
                 <w:sz w:val="19"/>
               </w:rPr>
-              <w:t>Students build new mathematical knowledge and solve problems that arise in mathematics and in other contexts.</w:t>
+              <w:t>comprehension of mathematical concepts, operations, and relations</w:t>
             </w:r>
           </w:p>
           <w:p>
@@ -612,7 +612,7 @@
                 <w:i w:val="0"/>
                 <w:sz w:val="20"/>
               </w:rPr>
-              <w:t>Reasoning and Proof</w:t>
+              <w:t>Procedural Fluency</w:t>
             </w:r>
           </w:p>
           <w:p>
@@ -640,7 +640,7 @@
                 <w:i/>
                 <w:sz w:val="19"/>
               </w:rPr>
-              <w:t>Students make and investigate mathematical conjectures and develop and evaluate mathematical arguments.</w:t>
+              <w:t>skill in carrying out procedures flexibly, accurately, efficiently, and appropriately</w:t>
             </w:r>
           </w:p>
           <w:p>
@@ -654,7 +654,7 @@
                 <w:i w:val="0"/>
                 <w:sz w:val="20"/>
               </w:rPr>
-              <w:t>Communication</w:t>
+              <w:t>Strategic Competence</w:t>
             </w:r>
           </w:p>
           <w:p>
@@ -682,7 +682,7 @@
                 <w:i/>
                 <w:sz w:val="19"/>
               </w:rPr>
-              <w:t>Students communicate their mathematical thinking coherently and clearly to peers, teachers, and others.</w:t>
+              <w:t>ability to formulate, represent, and solve mathematical problems</w:t>
             </w:r>
           </w:p>
           <w:p>
@@ -696,7 +696,7 @@
                 <w:i w:val="0"/>
                 <w:sz w:val="20"/>
               </w:rPr>
-              <w:t>Connections</w:t>
+              <w:t>Adaptive Reasoning</w:t>
             </w:r>
           </w:p>
           <w:p>
@@ -724,7 +724,7 @@
                 <w:i/>
                 <w:sz w:val="19"/>
               </w:rPr>
-              <w:t>Students recognize and apply mathematics in contexts outside of mathematics.</w:t>
+              <w:t>capacity for logical thought, reflection, explanation, and justification</w:t>
             </w:r>
           </w:p>
           <w:p>
@@ -738,7 +738,7 @@
                 <w:i w:val="0"/>
                 <w:sz w:val="20"/>
               </w:rPr>
-              <w:t>Representation</w:t>
+              <w:t>Productive Disposition</w:t>
             </w:r>
           </w:p>
           <w:p>
@@ -766,7 +766,7 @@
                 <w:i/>
                 <w:sz w:val="19"/>
               </w:rPr>
-              <w:t>Students use representations (drawings, number lines, tables, models) to model and interpret mathematical phenomena.</w:t>
+              <w:t>habitual inclination to see mathematics as sensible, useful, and worthwhile, coupled with a belief in diligence and one’s own efficacy</w:t>
             </w:r>
           </w:p>
         </w:tc>
@@ -5887,7 +5887,7 @@
                 <w:i w:val="0"/>
                 <w:sz w:val="18"/>
               </w:rPr>
-              <w:t xml:space="preserve">  Solve problems involving: a. percentage increase; b. percentage decrease.</w:t>
+              <w:t xml:space="preserve">  Solve problems involving: a. percentage increase, and b. percentage decrease.</w:t>
             </w:r>
           </w:p>
           <w:p>

</xml_diff>

<commit_message>
Add LSGH Math 7 SimBook with a custom simulation for every Term 1 lesson
- simbook/: interactive book (vanilla JS + SVG) with nine sims, missions,
  discovery reveals, and auto-generated self-checks
- LG: SIM LAB cards in every lesson pointing to the SimBook sim and tab;
  discussion steps now formalize what learners discovered in the sim
- CM: SimBook sims in activities and resources; roadmap shows signature sims

Co-Authored-By: Claude Opus 5.5 <noreply@anthropic.com>
Claude-Session: https://claude.ai/code/session_017G5QYgrCTCFugkQCNFUaXc
</commit_message>
<xml_diff>
--- a/output/grade7/Grade7-CM-1st_Trim-SY2026-2027-Mathematics.docx
+++ b/output/grade7/Grade7-CM-1st_Trim-SY2026-2027-Mathematics.docx
@@ -1133,7 +1133,7 @@
           <w:i/>
           <w:sz w:val="18"/>
         </w:rPr>
-        <w:t>5 meetings per cycle · 10 usable cycles (50 meetings) · Cycle 11 reserved as buffer</w:t>
+        <w:t>5 meetings per cycle · 10 usable cycles (50 meetings) · Cycle 11 reserved as buffer · Every lesson has its own simulation in the LSGH Math 7 SimBook</w:t>
       </w:r>
     </w:p>
     <w:tbl>
@@ -1152,16 +1152,45 @@
         <w:tblLayout w:type="fixed"/>
       </w:tblPr>
       <w:tblGrid>
+        <w:gridCol w:w="2500"/>
         <w:gridCol w:w="3000"/>
-        <w:gridCol w:w="4160"/>
-        <w:gridCol w:w="1500"/>
-        <w:gridCol w:w="1800"/>
-        <w:gridCol w:w="2500"/>
+        <w:gridCol w:w="1300"/>
+        <w:gridCol w:w="1600"/>
+        <w:gridCol w:w="2560"/>
+        <w:gridCol w:w="2000"/>
       </w:tblGrid>
       <w:tr>
         <w:trPr>
           <w:tblHeader w:val="true"/>
         </w:trPr>
+        <w:tc>
+          <w:tcPr>
+            <w:tcW w:type="dxa" w:w="2500"/>
+            <w:shd w:val="clear" w:color="auto" w:fill="38761D"/>
+            <w:tcMar>
+              <w:top w:w="60" w:type="dxa"/>
+              <w:bottom w:w="60" w:type="dxa"/>
+              <w:start w:w="80" w:type="dxa"/>
+              <w:end w:w="80" w:type="dxa"/>
+            </w:tcMar>
+          </w:tcPr>
+          <w:p>
+            <w:pPr>
+              <w:spacing w:before="0" w:after="40" w:line="240" w:lineRule="auto"/>
+              <w:jc w:val="center"/>
+            </w:pPr>
+            <w:r>
+              <w:rPr>
+                <w:rFonts w:ascii="Arial" w:hAnsi="Arial" w:eastAsia="Arial"/>
+                <w:b/>
+                <w:i w:val="0"/>
+                <w:color w:val="FFFFFF"/>
+                <w:sz w:val="18"/>
+              </w:rPr>
+              <w:t>UNIT</w:t>
+            </w:r>
+          </w:p>
+        </w:tc>
         <w:tc>
           <w:tcPr>
             <w:tcW w:type="dxa" w:w="3000"/>
@@ -1186,13 +1215,13 @@
                 <w:color w:val="FFFFFF"/>
                 <w:sz w:val="18"/>
               </w:rPr>
-              <w:t>UNIT</w:t>
+              <w:t>BIG QUESTION</w:t>
             </w:r>
           </w:p>
         </w:tc>
         <w:tc>
           <w:tcPr>
-            <w:tcW w:type="dxa" w:w="4160"/>
+            <w:tcW w:type="dxa" w:w="1300"/>
             <w:shd w:val="clear" w:color="auto" w:fill="38761D"/>
             <w:tcMar>
               <w:top w:w="60" w:type="dxa"/>
@@ -1214,13 +1243,13 @@
                 <w:color w:val="FFFFFF"/>
                 <w:sz w:val="18"/>
               </w:rPr>
-              <w:t>BIG QUESTION</w:t>
+              <w:t>DepEd WEEKS</w:t>
             </w:r>
           </w:p>
         </w:tc>
         <w:tc>
           <w:tcPr>
-            <w:tcW w:type="dxa" w:w="1500"/>
+            <w:tcW w:type="dxa" w:w="1600"/>
             <w:shd w:val="clear" w:color="auto" w:fill="38761D"/>
             <w:tcMar>
               <w:top w:w="60" w:type="dxa"/>
@@ -1242,13 +1271,13 @@
                 <w:color w:val="FFFFFF"/>
                 <w:sz w:val="18"/>
               </w:rPr>
-              <w:t>DepEd WEEKS</w:t>
+              <w:t>CYCLES</w:t>
             </w:r>
           </w:p>
         </w:tc>
         <w:tc>
           <w:tcPr>
-            <w:tcW w:type="dxa" w:w="1800"/>
+            <w:tcW w:type="dxa" w:w="2560"/>
             <w:shd w:val="clear" w:color="auto" w:fill="38761D"/>
             <w:tcMar>
               <w:top w:w="60" w:type="dxa"/>
@@ -1270,13 +1299,13 @@
                 <w:color w:val="FFFFFF"/>
                 <w:sz w:val="18"/>
               </w:rPr>
-              <w:t>CYCLES</w:t>
+              <w:t>SIGNATURE SIMS</w:t>
             </w:r>
           </w:p>
         </w:tc>
         <w:tc>
           <w:tcPr>
-            <w:tcW w:type="dxa" w:w="2500"/>
+            <w:tcW w:type="dxa" w:w="2000"/>
             <w:shd w:val="clear" w:color="auto" w:fill="38761D"/>
             <w:tcMar>
               <w:top w:w="60" w:type="dxa"/>
@@ -1307,6 +1336,33 @@
         <w:trPr>
           <w:cantSplit/>
         </w:trPr>
+        <w:tc>
+          <w:tcPr>
+            <w:tcW w:type="dxa" w:w="2500"/>
+            <w:tcMar>
+              <w:top w:w="60" w:type="dxa"/>
+              <w:bottom w:w="60" w:type="dxa"/>
+              <w:start w:w="80" w:type="dxa"/>
+              <w:end w:w="80" w:type="dxa"/>
+            </w:tcMar>
+            <w:shd w:val="clear" w:color="auto" w:fill="D9EAD3"/>
+            <w:vAlign w:val="center"/>
+          </w:tcPr>
+          <w:p>
+            <w:pPr>
+              <w:spacing w:before="0" w:after="40" w:line="240" w:lineRule="auto"/>
+            </w:pPr>
+            <w:r>
+              <w:rPr>
+                <w:rFonts w:ascii="Arial" w:hAnsi="Arial" w:eastAsia="Arial"/>
+                <w:b/>
+                <w:i w:val="0"/>
+                <w:sz w:val="18"/>
+              </w:rPr>
+              <w:t>Unit A · SHAPE UP! Polygons and Angles</w:t>
+            </w:r>
+          </w:p>
+        </w:tc>
         <w:tc>
           <w:tcPr>
             <w:tcW w:type="dxa" w:w="3000"/>
@@ -1316,7 +1372,6 @@
               <w:start w:w="80" w:type="dxa"/>
               <w:end w:w="80" w:type="dxa"/>
             </w:tcMar>
-            <w:shd w:val="clear" w:color="auto" w:fill="D9EAD3"/>
             <w:vAlign w:val="center"/>
           </w:tcPr>
           <w:p>
@@ -1326,17 +1381,17 @@
             <w:r>
               <w:rPr>
                 <w:rFonts w:ascii="Arial" w:hAnsi="Arial" w:eastAsia="Arial"/>
-                <w:b/>
-                <w:i w:val="0"/>
-                <w:sz w:val="18"/>
-              </w:rPr>
-              <w:t>Unit A · SHAPE UP! Polygons and Angles</w:t>
+                <w:b w:val="0"/>
+                <w:i w:val="0"/>
+                <w:sz w:val="18"/>
+              </w:rPr>
+              <w:t>Why do honeycombs use hexagons and stop signs have eight sides?</w:t>
             </w:r>
           </w:p>
         </w:tc>
         <w:tc>
           <w:tcPr>
-            <w:tcW w:type="dxa" w:w="4160"/>
+            <w:tcW w:type="dxa" w:w="1300"/>
             <w:tcMar>
               <w:top w:w="60" w:type="dxa"/>
               <w:bottom w:w="60" w:type="dxa"/>
@@ -1356,13 +1411,13 @@
                 <w:i w:val="0"/>
                 <w:sz w:val="18"/>
               </w:rPr>
-              <w:t>Why do honeycombs use hexagons and stop signs have eight sides?</w:t>
+              <w:t>Weeks 1–3</w:t>
             </w:r>
           </w:p>
         </w:tc>
         <w:tc>
           <w:tcPr>
-            <w:tcW w:type="dxa" w:w="1500"/>
+            <w:tcW w:type="dxa" w:w="1600"/>
             <w:tcMar>
               <w:top w:w="60" w:type="dxa"/>
               <w:bottom w:w="60" w:type="dxa"/>
@@ -1382,13 +1437,13 @@
                 <w:i w:val="0"/>
                 <w:sz w:val="18"/>
               </w:rPr>
-              <w:t>Weeks 1–3</w:t>
+              <w:t>C1,M2 – C4,M1</w:t>
             </w:r>
           </w:p>
         </w:tc>
         <w:tc>
           <w:tcPr>
-            <w:tcW w:type="dxa" w:w="1800"/>
+            <w:tcW w:type="dxa" w:w="2560"/>
             <w:tcMar>
               <w:top w:w="60" w:type="dxa"/>
               <w:bottom w:w="60" w:type="dxa"/>
@@ -1408,10 +1463,41 @@
                 <w:i w:val="0"/>
                 <w:sz w:val="18"/>
               </w:rPr>
-              <w:t>C1,M2 – C4,M1</w:t>
+              <w:t>Polygon Studio · Angle Pair Lab · Angle Sum Machine</w:t>
             </w:r>
           </w:p>
         </w:tc>
+        <w:tc>
+          <w:tcPr>
+            <w:tcW w:type="dxa" w:w="2000"/>
+            <w:tcMar>
+              <w:top w:w="60" w:type="dxa"/>
+              <w:bottom w:w="60" w:type="dxa"/>
+              <w:start w:w="80" w:type="dxa"/>
+              <w:end w:w="80" w:type="dxa"/>
+            </w:tcMar>
+            <w:vAlign w:val="center"/>
+          </w:tcPr>
+          <w:p>
+            <w:pPr>
+              <w:spacing w:before="0" w:after="40" w:line="240" w:lineRule="auto"/>
+            </w:pPr>
+            <w:r>
+              <w:rPr>
+                <w:rFonts w:ascii="Arial" w:hAnsi="Arial" w:eastAsia="Arial"/>
+                <w:b w:val="0"/>
+                <w:i w:val="0"/>
+                <w:sz w:val="18"/>
+              </w:rPr>
+              <w:t>SA1.1 Polygon Design Challenge</w:t>
+            </w:r>
+          </w:p>
+        </w:tc>
+      </w:tr>
+      <w:tr>
+        <w:trPr>
+          <w:cantSplit/>
+        </w:trPr>
         <w:tc>
           <w:tcPr>
             <w:tcW w:type="dxa" w:w="2500"/>
@@ -1421,6 +1507,7 @@
               <w:start w:w="80" w:type="dxa"/>
               <w:end w:w="80" w:type="dxa"/>
             </w:tcMar>
+            <w:shd w:val="clear" w:color="auto" w:fill="D9EAD3"/>
             <w:vAlign w:val="center"/>
           </w:tcPr>
           <w:p>
@@ -1430,19 +1517,14 @@
             <w:r>
               <w:rPr>
                 <w:rFonts w:ascii="Arial" w:hAnsi="Arial" w:eastAsia="Arial"/>
-                <w:b w:val="0"/>
-                <w:i w:val="0"/>
-                <w:sz w:val="18"/>
-              </w:rPr>
-              <w:t>SA1.1 Polygon Design Challenge</w:t>
+                <w:b/>
+                <w:i w:val="0"/>
+                <w:sz w:val="18"/>
+              </w:rPr>
+              <w:t>Unit B · MONEY SMART! Percentages, Financial Planning, and Rates</w:t>
             </w:r>
           </w:p>
         </w:tc>
-      </w:tr>
-      <w:tr>
-        <w:trPr>
-          <w:cantSplit/>
-        </w:trPr>
         <w:tc>
           <w:tcPr>
             <w:tcW w:type="dxa" w:w="3000"/>
@@ -1452,7 +1534,6 @@
               <w:start w:w="80" w:type="dxa"/>
               <w:end w:w="80" w:type="dxa"/>
             </w:tcMar>
-            <w:shd w:val="clear" w:color="auto" w:fill="D9EAD3"/>
             <w:vAlign w:val="center"/>
           </w:tcPr>
           <w:p>
@@ -1462,17 +1543,17 @@
             <w:r>
               <w:rPr>
                 <w:rFonts w:ascii="Arial" w:hAnsi="Arial" w:eastAsia="Arial"/>
-                <w:b/>
-                <w:i w:val="0"/>
-                <w:sz w:val="18"/>
-              </w:rPr>
-              <w:t>Unit B · MONEY SMART! Percentages, Financial Planning, and Rates</w:t>
+                <w:b w:val="0"/>
+                <w:i w:val="0"/>
+                <w:sz w:val="18"/>
+              </w:rPr>
+              <w:t>Is “Buy 1, Take 1” really the same as 50% off?</w:t>
             </w:r>
           </w:p>
         </w:tc>
         <w:tc>
           <w:tcPr>
-            <w:tcW w:type="dxa" w:w="4160"/>
+            <w:tcW w:type="dxa" w:w="1300"/>
             <w:tcMar>
               <w:top w:w="60" w:type="dxa"/>
               <w:bottom w:w="60" w:type="dxa"/>
@@ -1492,13 +1573,13 @@
                 <w:i w:val="0"/>
                 <w:sz w:val="18"/>
               </w:rPr>
-              <w:t>Is “Buy 1, Take 1” really the same as 50% off?</w:t>
+              <w:t>Weeks 4–6</w:t>
             </w:r>
           </w:p>
         </w:tc>
         <w:tc>
           <w:tcPr>
-            <w:tcW w:type="dxa" w:w="1500"/>
+            <w:tcW w:type="dxa" w:w="1600"/>
             <w:tcMar>
               <w:top w:w="60" w:type="dxa"/>
               <w:bottom w:w="60" w:type="dxa"/>
@@ -1518,13 +1599,13 @@
                 <w:i w:val="0"/>
                 <w:sz w:val="18"/>
               </w:rPr>
-              <w:t>Weeks 4–6</w:t>
+              <w:t>C4,M2 – C6,M5</w:t>
             </w:r>
           </w:p>
         </w:tc>
         <w:tc>
           <w:tcPr>
-            <w:tcW w:type="dxa" w:w="1800"/>
+            <w:tcW w:type="dxa" w:w="2560"/>
             <w:tcMar>
               <w:top w:w="60" w:type="dxa"/>
               <w:bottom w:w="60" w:type="dxa"/>
@@ -1544,10 +1625,41 @@
                 <w:i w:val="0"/>
                 <w:sz w:val="18"/>
               </w:rPr>
-              <w:t>C4,M2 – C6,M5</w:t>
+              <w:t>LSGH Mini Mall · Baon Life Sim · Rate Racer</w:t>
             </w:r>
           </w:p>
         </w:tc>
+        <w:tc>
+          <w:tcPr>
+            <w:tcW w:type="dxa" w:w="2000"/>
+            <w:tcMar>
+              <w:top w:w="60" w:type="dxa"/>
+              <w:bottom w:w="60" w:type="dxa"/>
+              <w:start w:w="80" w:type="dxa"/>
+              <w:end w:w="80" w:type="dxa"/>
+            </w:tcMar>
+            <w:vAlign w:val="center"/>
+          </w:tcPr>
+          <w:p>
+            <w:pPr>
+              <w:spacing w:before="0" w:after="40" w:line="240" w:lineRule="auto"/>
+            </w:pPr>
+            <w:r>
+              <w:rPr>
+                <w:rFonts w:ascii="Arial" w:hAnsi="Arial" w:eastAsia="Arial"/>
+                <w:b w:val="0"/>
+                <w:i w:val="0"/>
+                <w:sz w:val="18"/>
+              </w:rPr>
+              <w:t>SA1.2 Best Buy Battle · PT1.1 launch</w:t>
+            </w:r>
+          </w:p>
+        </w:tc>
+      </w:tr>
+      <w:tr>
+        <w:trPr>
+          <w:cantSplit/>
+        </w:trPr>
         <w:tc>
           <w:tcPr>
             <w:tcW w:type="dxa" w:w="2500"/>
@@ -1557,6 +1669,7 @@
               <w:start w:w="80" w:type="dxa"/>
               <w:end w:w="80" w:type="dxa"/>
             </w:tcMar>
+            <w:shd w:val="clear" w:color="auto" w:fill="D9EAD3"/>
             <w:vAlign w:val="center"/>
           </w:tcPr>
           <w:p>
@@ -1566,19 +1679,14 @@
             <w:r>
               <w:rPr>
                 <w:rFonts w:ascii="Arial" w:hAnsi="Arial" w:eastAsia="Arial"/>
-                <w:b w:val="0"/>
-                <w:i w:val="0"/>
-                <w:sz w:val="18"/>
-              </w:rPr>
-              <w:t>SA1.2 Best Buy Battle · PT1.1 launch</w:t>
+                <w:b/>
+                <w:i w:val="0"/>
+                <w:sz w:val="18"/>
+              </w:rPr>
+              <w:t>Unit C · NUMBER LINE ADVENTURES! Rational Numbers and Roots</w:t>
             </w:r>
           </w:p>
         </w:tc>
-      </w:tr>
-      <w:tr>
-        <w:trPr>
-          <w:cantSplit/>
-        </w:trPr>
         <w:tc>
           <w:tcPr>
             <w:tcW w:type="dxa" w:w="3000"/>
@@ -1588,7 +1696,6 @@
               <w:start w:w="80" w:type="dxa"/>
               <w:end w:w="80" w:type="dxa"/>
             </w:tcMar>
-            <w:shd w:val="clear" w:color="auto" w:fill="D9EAD3"/>
             <w:vAlign w:val="center"/>
           </w:tcPr>
           <w:p>
@@ -1598,17 +1705,17 @@
             <w:r>
               <w:rPr>
                 <w:rFonts w:ascii="Arial" w:hAnsi="Arial" w:eastAsia="Arial"/>
-                <w:b/>
-                <w:i w:val="0"/>
-                <w:sz w:val="18"/>
-              </w:rPr>
-              <w:t>Unit C · NUMBER LINE ADVENTURES! Rational Numbers and Roots</w:t>
+                <w:b w:val="0"/>
+                <w:i w:val="0"/>
+                <w:sz w:val="18"/>
+              </w:rPr>
+              <w:t>Can a square tile have an area of exactly 2 square units?</w:t>
             </w:r>
           </w:p>
         </w:tc>
         <w:tc>
           <w:tcPr>
-            <w:tcW w:type="dxa" w:w="4160"/>
+            <w:tcW w:type="dxa" w:w="1300"/>
             <w:tcMar>
               <w:top w:w="60" w:type="dxa"/>
               <w:bottom w:w="60" w:type="dxa"/>
@@ -1628,13 +1735,13 @@
                 <w:i w:val="0"/>
                 <w:sz w:val="18"/>
               </w:rPr>
-              <w:t>Can a square tile have an area of exactly 2 square units?</w:t>
+              <w:t>Weeks 7–10</w:t>
             </w:r>
           </w:p>
         </w:tc>
         <w:tc>
           <w:tcPr>
-            <w:tcW w:type="dxa" w:w="1500"/>
+            <w:tcW w:type="dxa" w:w="1600"/>
             <w:tcMar>
               <w:top w:w="60" w:type="dxa"/>
               <w:bottom w:w="60" w:type="dxa"/>
@@ -1654,13 +1761,13 @@
                 <w:i w:val="0"/>
                 <w:sz w:val="18"/>
               </w:rPr>
-              <w:t>Weeks 7–10</w:t>
+              <w:t>C7,M1 – C10,M1</w:t>
             </w:r>
           </w:p>
         </w:tc>
         <w:tc>
           <w:tcPr>
-            <w:tcW w:type="dxa" w:w="1800"/>
+            <w:tcW w:type="dxa" w:w="2560"/>
             <w:tcMar>
               <w:top w:w="60" w:type="dxa"/>
               <w:bottom w:w="60" w:type="dxa"/>
@@ -1680,10 +1787,41 @@
                 <w:i w:val="0"/>
                 <w:sz w:val="18"/>
               </w:rPr>
-              <w:t>C7,M1 – C10,M1</w:t>
+              <w:t>Number Line Explorer · Fraction Kitchen · Roots Lab</w:t>
             </w:r>
           </w:p>
         </w:tc>
+        <w:tc>
+          <w:tcPr>
+            <w:tcW w:type="dxa" w:w="2000"/>
+            <w:tcMar>
+              <w:top w:w="60" w:type="dxa"/>
+              <w:bottom w:w="60" w:type="dxa"/>
+              <w:start w:w="80" w:type="dxa"/>
+              <w:end w:w="80" w:type="dxa"/>
+            </w:tcMar>
+            <w:vAlign w:val="center"/>
+          </w:tcPr>
+          <w:p>
+            <w:pPr>
+              <w:spacing w:before="0" w:after="40" w:line="240" w:lineRule="auto"/>
+            </w:pPr>
+            <w:r>
+              <w:rPr>
+                <w:rFonts w:ascii="Arial" w:hAnsi="Arial" w:eastAsia="Arial"/>
+                <w:b w:val="0"/>
+                <w:i w:val="0"/>
+                <w:sz w:val="18"/>
+              </w:rPr>
+              <w:t>SA1.3 Rational Relay</w:t>
+            </w:r>
+          </w:p>
+        </w:tc>
+      </w:tr>
+      <w:tr>
+        <w:trPr>
+          <w:cantSplit/>
+        </w:trPr>
         <w:tc>
           <w:tcPr>
             <w:tcW w:type="dxa" w:w="2500"/>
@@ -1693,6 +1831,7 @@
               <w:start w:w="80" w:type="dxa"/>
               <w:end w:w="80" w:type="dxa"/>
             </w:tcMar>
+            <w:shd w:val="clear" w:color="auto" w:fill="D0E0E3"/>
             <w:vAlign w:val="center"/>
           </w:tcPr>
           <w:p>
@@ -1702,19 +1841,14 @@
             <w:r>
               <w:rPr>
                 <w:rFonts w:ascii="Arial" w:hAnsi="Arial" w:eastAsia="Arial"/>
-                <w:b w:val="0"/>
-                <w:i w:val="0"/>
-                <w:sz w:val="18"/>
-              </w:rPr>
-              <w:t>SA1.3 Rational Relay</w:t>
+                <w:b/>
+                <w:i w:val="0"/>
+                <w:sz w:val="18"/>
+              </w:rPr>
+              <w:t>Performance Task · BUDGET FOR A CAUSE</w:t>
             </w:r>
           </w:p>
         </w:tc>
-      </w:tr>
-      <w:tr>
-        <w:trPr>
-          <w:cantSplit/>
-        </w:trPr>
         <w:tc>
           <w:tcPr>
             <w:tcW w:type="dxa" w:w="3000"/>
@@ -1724,7 +1858,6 @@
               <w:start w:w="80" w:type="dxa"/>
               <w:end w:w="80" w:type="dxa"/>
             </w:tcMar>
-            <w:shd w:val="clear" w:color="auto" w:fill="D0E0E3"/>
             <w:vAlign w:val="center"/>
           </w:tcPr>
           <w:p>
@@ -1734,17 +1867,17 @@
             <w:r>
               <w:rPr>
                 <w:rFonts w:ascii="Arial" w:hAnsi="Arial" w:eastAsia="Arial"/>
-                <w:b/>
-                <w:i w:val="0"/>
-                <w:sz w:val="18"/>
-              </w:rPr>
-              <w:t>Performance Task · BUDGET FOR A CAUSE</w:t>
+                <w:b w:val="0"/>
+                <w:i w:val="0"/>
+                <w:sz w:val="18"/>
+              </w:rPr>
+              <w:t>How can wise budgeting help me serve others?</w:t>
             </w:r>
           </w:p>
         </w:tc>
         <w:tc>
           <w:tcPr>
-            <w:tcW w:type="dxa" w:w="4160"/>
+            <w:tcW w:type="dxa" w:w="1300"/>
             <w:tcMar>
               <w:top w:w="60" w:type="dxa"/>
               <w:bottom w:w="60" w:type="dxa"/>
@@ -1764,13 +1897,13 @@
                 <w:i w:val="0"/>
                 <w:sz w:val="18"/>
               </w:rPr>
-              <w:t>How can wise budgeting help me serve others?</w:t>
+              <w:t>Week 5 (Create a financial plan)</w:t>
             </w:r>
           </w:p>
         </w:tc>
         <w:tc>
           <w:tcPr>
-            <w:tcW w:type="dxa" w:w="1500"/>
+            <w:tcW w:type="dxa" w:w="1600"/>
             <w:tcMar>
               <w:top w:w="60" w:type="dxa"/>
               <w:bottom w:w="60" w:type="dxa"/>
@@ -1790,13 +1923,13 @@
                 <w:i w:val="0"/>
                 <w:sz w:val="18"/>
               </w:rPr>
-              <w:t>Week 5 (Create a financial plan)</w:t>
+              <w:t>C5 – C10,M3</w:t>
             </w:r>
           </w:p>
         </w:tc>
         <w:tc>
           <w:tcPr>
-            <w:tcW w:type="dxa" w:w="1800"/>
+            <w:tcW w:type="dxa" w:w="2560"/>
             <w:tcMar>
               <w:top w:w="60" w:type="dxa"/>
               <w:bottom w:w="60" w:type="dxa"/>
@@ -1816,10 +1949,41 @@
                 <w:i w:val="0"/>
                 <w:sz w:val="18"/>
               </w:rPr>
-              <w:t>C5 – C10,M3</w:t>
+              <w:t>Baon Life Sim (planning practice)</w:t>
             </w:r>
           </w:p>
         </w:tc>
+        <w:tc>
+          <w:tcPr>
+            <w:tcW w:type="dxa" w:w="2000"/>
+            <w:tcMar>
+              <w:top w:w="60" w:type="dxa"/>
+              <w:bottom w:w="60" w:type="dxa"/>
+              <w:start w:w="80" w:type="dxa"/>
+              <w:end w:w="80" w:type="dxa"/>
+            </w:tcMar>
+            <w:vAlign w:val="center"/>
+          </w:tcPr>
+          <w:p>
+            <w:pPr>
+              <w:spacing w:before="0" w:after="40" w:line="240" w:lineRule="auto"/>
+            </w:pPr>
+            <w:r>
+              <w:rPr>
+                <w:rFonts w:ascii="Arial" w:hAnsi="Arial" w:eastAsia="Arial"/>
+                <w:b w:val="0"/>
+                <w:i w:val="0"/>
+                <w:sz w:val="18"/>
+              </w:rPr>
+              <w:t>PT1.1 Financial Plan Pitch</w:t>
+            </w:r>
+          </w:p>
+        </w:tc>
+      </w:tr>
+      <w:tr>
+        <w:trPr>
+          <w:cantSplit/>
+        </w:trPr>
         <w:tc>
           <w:tcPr>
             <w:tcW w:type="dxa" w:w="2500"/>
@@ -1829,6 +1993,7 @@
               <w:start w:w="80" w:type="dxa"/>
               <w:end w:w="80" w:type="dxa"/>
             </w:tcMar>
+            <w:shd w:val="clear" w:color="auto" w:fill="FCE5CD"/>
             <w:vAlign w:val="center"/>
           </w:tcPr>
           <w:p>
@@ -1838,19 +2003,14 @@
             <w:r>
               <w:rPr>
                 <w:rFonts w:ascii="Arial" w:hAnsi="Arial" w:eastAsia="Arial"/>
-                <w:b w:val="0"/>
-                <w:i w:val="0"/>
-                <w:sz w:val="18"/>
-              </w:rPr>
-              <w:t>PT1.1 Financial Plan Pitch</w:t>
+                <w:b/>
+                <w:i w:val="0"/>
+                <w:sz w:val="18"/>
+              </w:rPr>
+              <w:t>Review and Term Exam</w:t>
             </w:r>
           </w:p>
         </w:tc>
-      </w:tr>
-      <w:tr>
-        <w:trPr>
-          <w:cantSplit/>
-        </w:trPr>
         <w:tc>
           <w:tcPr>
             <w:tcW w:type="dxa" w:w="3000"/>
@@ -1860,7 +2020,6 @@
               <w:start w:w="80" w:type="dxa"/>
               <w:end w:w="80" w:type="dxa"/>
             </w:tcMar>
-            <w:shd w:val="clear" w:color="auto" w:fill="FCE5CD"/>
             <w:vAlign w:val="center"/>
           </w:tcPr>
           <w:p>
@@ -1870,17 +2029,17 @@
             <w:r>
               <w:rPr>
                 <w:rFonts w:ascii="Arial" w:hAnsi="Arial" w:eastAsia="Arial"/>
-                <w:b/>
-                <w:i w:val="0"/>
-                <w:sz w:val="18"/>
-              </w:rPr>
-              <w:t>Review and Term Exam</w:t>
+                <w:b w:val="0"/>
+                <w:i w:val="0"/>
+                <w:sz w:val="18"/>
+              </w:rPr>
+              <w:t>What have I mastered, and what will I improve?</w:t>
             </w:r>
           </w:p>
         </w:tc>
         <w:tc>
           <w:tcPr>
-            <w:tcW w:type="dxa" w:w="4160"/>
+            <w:tcW w:type="dxa" w:w="1300"/>
             <w:tcMar>
               <w:top w:w="60" w:type="dxa"/>
               <w:bottom w:w="60" w:type="dxa"/>
@@ -1900,13 +2059,13 @@
                 <w:i w:val="0"/>
                 <w:sz w:val="18"/>
               </w:rPr>
-              <w:t>What have I mastered, and what will I improve?</w:t>
+              <w:t>—</w:t>
             </w:r>
           </w:p>
         </w:tc>
         <w:tc>
           <w:tcPr>
-            <w:tcW w:type="dxa" w:w="1500"/>
+            <w:tcW w:type="dxa" w:w="1600"/>
             <w:tcMar>
               <w:top w:w="60" w:type="dxa"/>
               <w:bottom w:w="60" w:type="dxa"/>
@@ -1926,13 +2085,13 @@
                 <w:i w:val="0"/>
                 <w:sz w:val="18"/>
               </w:rPr>
-              <w:t>—</w:t>
+              <w:t>C10,M4 – C10,M5</w:t>
             </w:r>
           </w:p>
         </w:tc>
         <w:tc>
           <w:tcPr>
-            <w:tcW w:type="dxa" w:w="1800"/>
+            <w:tcW w:type="dxa" w:w="2560"/>
             <w:tcMar>
               <w:top w:w="60" w:type="dxa"/>
               <w:bottom w:w="60" w:type="dxa"/>
@@ -1952,10 +2111,41 @@
                 <w:i w:val="0"/>
                 <w:sz w:val="18"/>
               </w:rPr>
-              <w:t>C10,M4 – C10,M5</w:t>
+              <w:t>SimBook self-checks</w:t>
             </w:r>
           </w:p>
         </w:tc>
+        <w:tc>
+          <w:tcPr>
+            <w:tcW w:type="dxa" w:w="2000"/>
+            <w:tcMar>
+              <w:top w:w="60" w:type="dxa"/>
+              <w:bottom w:w="60" w:type="dxa"/>
+              <w:start w:w="80" w:type="dxa"/>
+              <w:end w:w="80" w:type="dxa"/>
+            </w:tcMar>
+            <w:vAlign w:val="center"/>
+          </w:tcPr>
+          <w:p>
+            <w:pPr>
+              <w:spacing w:before="0" w:after="40" w:line="240" w:lineRule="auto"/>
+            </w:pPr>
+            <w:r>
+              <w:rPr>
+                <w:rFonts w:ascii="Arial" w:hAnsi="Arial" w:eastAsia="Arial"/>
+                <w:b w:val="0"/>
+                <w:i w:val="0"/>
+                <w:sz w:val="18"/>
+              </w:rPr>
+              <w:t>TE1.1 Term Exam</w:t>
+            </w:r>
+          </w:p>
+        </w:tc>
+      </w:tr>
+      <w:tr>
+        <w:trPr>
+          <w:cantSplit/>
+        </w:trPr>
         <w:tc>
           <w:tcPr>
             <w:tcW w:type="dxa" w:w="2500"/>
@@ -1965,6 +2155,7 @@
               <w:start w:w="80" w:type="dxa"/>
               <w:end w:w="80" w:type="dxa"/>
             </w:tcMar>
+            <w:shd w:val="clear" w:color="auto" w:fill="EFEFEF"/>
             <w:vAlign w:val="center"/>
           </w:tcPr>
           <w:p>
@@ -1974,19 +2165,14 @@
             <w:r>
               <w:rPr>
                 <w:rFonts w:ascii="Arial" w:hAnsi="Arial" w:eastAsia="Arial"/>
-                <w:b w:val="0"/>
-                <w:i w:val="0"/>
-                <w:sz w:val="18"/>
-              </w:rPr>
-              <w:t>TE1.1 Term Exam</w:t>
+                <w:b/>
+                <w:i w:val="0"/>
+                <w:sz w:val="18"/>
+              </w:rPr>
+              <w:t>Buffer Cycle</w:t>
             </w:r>
           </w:p>
         </w:tc>
-      </w:tr>
-      <w:tr>
-        <w:trPr>
-          <w:cantSplit/>
-        </w:trPr>
         <w:tc>
           <w:tcPr>
             <w:tcW w:type="dxa" w:w="3000"/>
@@ -1996,7 +2182,6 @@
               <w:start w:w="80" w:type="dxa"/>
               <w:end w:w="80" w:type="dxa"/>
             </w:tcMar>
-            <w:shd w:val="clear" w:color="auto" w:fill="EFEFEF"/>
             <w:vAlign w:val="center"/>
           </w:tcPr>
           <w:p>
@@ -2006,17 +2191,17 @@
             <w:r>
               <w:rPr>
                 <w:rFonts w:ascii="Arial" w:hAnsi="Arial" w:eastAsia="Arial"/>
-                <w:b/>
-                <w:i w:val="0"/>
-                <w:sz w:val="18"/>
-              </w:rPr>
-              <w:t>Buffer Cycle</w:t>
+                <w:b w:val="0"/>
+                <w:i w:val="0"/>
+                <w:sz w:val="18"/>
+              </w:rPr>
+              <w:t>—</w:t>
             </w:r>
           </w:p>
         </w:tc>
         <w:tc>
           <w:tcPr>
-            <w:tcW w:type="dxa" w:w="4160"/>
+            <w:tcW w:type="dxa" w:w="1300"/>
             <w:tcMar>
               <w:top w:w="60" w:type="dxa"/>
               <w:bottom w:w="60" w:type="dxa"/>
@@ -2042,7 +2227,7 @@
         </w:tc>
         <w:tc>
           <w:tcPr>
-            <w:tcW w:type="dxa" w:w="1500"/>
+            <w:tcW w:type="dxa" w:w="1600"/>
             <w:tcMar>
               <w:top w:w="60" w:type="dxa"/>
               <w:bottom w:w="60" w:type="dxa"/>
@@ -2062,13 +2247,13 @@
                 <w:i w:val="0"/>
                 <w:sz w:val="18"/>
               </w:rPr>
-              <w:t>—</w:t>
+              <w:t>C11</w:t>
             </w:r>
           </w:p>
         </w:tc>
         <w:tc>
           <w:tcPr>
-            <w:tcW w:type="dxa" w:w="1800"/>
+            <w:tcW w:type="dxa" w:w="2560"/>
             <w:tcMar>
               <w:top w:w="60" w:type="dxa"/>
               <w:bottom w:w="60" w:type="dxa"/>
@@ -2088,13 +2273,13 @@
                 <w:i w:val="0"/>
                 <w:sz w:val="18"/>
               </w:rPr>
-              <w:t>C11</w:t>
+              <w:t>SimBook for remediation</w:t>
             </w:r>
           </w:p>
         </w:tc>
         <w:tc>
           <w:tcPr>
-            <w:tcW w:type="dxa" w:w="2500"/>
+            <w:tcW w:type="dxa" w:w="2000"/>
             <w:tcMar>
               <w:top w:w="60" w:type="dxa"/>
               <w:bottom w:w="60" w:type="dxa"/>
@@ -3591,6 +3776,44 @@
             <w:r>
               <w:rPr>
                 <w:rFonts w:ascii="Arial" w:hAnsi="Arial" w:eastAsia="Arial"/>
+                <w:b/>
+                <w:i w:val="0"/>
+                <w:color w:val="38761D"/>
+                <w:sz w:val="18"/>
+              </w:rPr>
+              <w:t>SIM LAB:</w:t>
+            </w:r>
+            <w:r>
+              <w:rPr>
+                <w:rFonts w:ascii="Arial" w:hAnsi="Arial" w:eastAsia="Arial"/>
+                <w:b w:val="0"/>
+                <w:i w:val="0"/>
+                <w:sz w:val="18"/>
+              </w:rPr>
+              <w:t xml:space="preserve"> SimBook – Polygon Studio (Explore, Build It)</w:t>
+            </w:r>
+          </w:p>
+          <w:p>
+            <w:pPr>
+              <w:tabs>
+                <w:tab w:pos="220" w:val="left"/>
+              </w:tabs>
+              <w:spacing w:before="0" w:after="40" w:line="240" w:lineRule="auto"/>
+              <w:ind w:left="220" w:hanging="220"/>
+            </w:pPr>
+            <w:r>
+              <w:rPr>
+                <w:rFonts w:ascii="Arial" w:hAnsi="Arial" w:eastAsia="Arial"/>
+                <w:b w:val="0"/>
+                <w:i w:val="0"/>
+                <w:sz w:val="18"/>
+              </w:rPr>
+              <w:t>3.</w:t>
+              <w:tab/>
+            </w:r>
+            <w:r>
+              <w:rPr>
+                <w:rFonts w:ascii="Arial" w:hAnsi="Arial" w:eastAsia="Arial"/>
                 <w:b w:val="0"/>
                 <w:i w:val="0"/>
                 <w:sz w:val="18"/>
@@ -3613,7 +3836,7 @@
                 <w:i w:val="0"/>
                 <w:sz w:val="18"/>
               </w:rPr>
-              <w:t>3.</w:t>
+              <w:t>4.</w:t>
               <w:tab/>
             </w:r>
             <w:r>
@@ -3641,7 +3864,7 @@
                 <w:i w:val="0"/>
                 <w:sz w:val="18"/>
               </w:rPr>
-              <w:t>4.</w:t>
+              <w:t>5.</w:t>
               <w:tab/>
             </w:r>
             <w:r>
@@ -3665,6 +3888,34 @@
               <w:end w:w="80" w:type="dxa"/>
             </w:tcMar>
           </w:tcPr>
+          <w:p>
+            <w:pPr>
+              <w:tabs>
+                <w:tab w:pos="220" w:val="left"/>
+              </w:tabs>
+              <w:spacing w:before="0" w:after="40" w:line="240" w:lineRule="auto"/>
+              <w:ind w:left="220" w:hanging="220"/>
+            </w:pPr>
+            <w:r>
+              <w:rPr>
+                <w:rFonts w:ascii="Arial" w:hAnsi="Arial" w:eastAsia="Arial"/>
+                <w:b w:val="0"/>
+                <w:i w:val="0"/>
+                <w:sz w:val="18"/>
+              </w:rPr>
+              <w:t>•</w:t>
+              <w:tab/>
+            </w:r>
+            <w:r>
+              <w:rPr>
+                <w:rFonts w:ascii="Arial" w:hAnsi="Arial" w:eastAsia="Arial"/>
+                <w:b w:val="0"/>
+                <w:i w:val="0"/>
+                <w:sz w:val="18"/>
+              </w:rPr>
+              <w:t>LSGH Math 7 SimBook – Lesson 1</w:t>
+            </w:r>
+          </w:p>
           <w:p>
             <w:pPr>
               <w:tabs>
@@ -4298,6 +4549,44 @@
             <w:r>
               <w:rPr>
                 <w:rFonts w:ascii="Arial" w:hAnsi="Arial" w:eastAsia="Arial"/>
+                <w:b/>
+                <w:i w:val="0"/>
+                <w:color w:val="38761D"/>
+                <w:sz w:val="18"/>
+              </w:rPr>
+              <w:t>SIM LAB:</w:t>
+            </w:r>
+            <w:r>
+              <w:rPr>
+                <w:rFonts w:ascii="Arial" w:hAnsi="Arial" w:eastAsia="Arial"/>
+                <w:b w:val="0"/>
+                <w:i w:val="0"/>
+                <w:sz w:val="18"/>
+              </w:rPr>
+              <w:t xml:space="preserve"> SimBook – Angle Pair Lab (Intersecting Lines, Split an Angle, Classify Polygons)</w:t>
+            </w:r>
+          </w:p>
+          <w:p>
+            <w:pPr>
+              <w:tabs>
+                <w:tab w:pos="220" w:val="left"/>
+              </w:tabs>
+              <w:spacing w:before="0" w:after="40" w:line="240" w:lineRule="auto"/>
+              <w:ind w:left="220" w:hanging="220"/>
+            </w:pPr>
+            <w:r>
+              <w:rPr>
+                <w:rFonts w:ascii="Arial" w:hAnsi="Arial" w:eastAsia="Arial"/>
+                <w:b w:val="0"/>
+                <w:i w:val="0"/>
+                <w:sz w:val="18"/>
+              </w:rPr>
+              <w:t>3.</w:t>
+              <w:tab/>
+            </w:r>
+            <w:r>
+              <w:rPr>
+                <w:rFonts w:ascii="Arial" w:hAnsi="Arial" w:eastAsia="Arial"/>
                 <w:b w:val="0"/>
                 <w:i w:val="0"/>
                 <w:sz w:val="18"/>
@@ -4320,7 +4609,7 @@
                 <w:i w:val="0"/>
                 <w:sz w:val="18"/>
               </w:rPr>
-              <w:t>3.</w:t>
+              <w:t>4.</w:t>
               <w:tab/>
             </w:r>
             <w:r>
@@ -4348,7 +4637,7 @@
                 <w:i w:val="0"/>
                 <w:sz w:val="18"/>
               </w:rPr>
-              <w:t>4.</w:t>
+              <w:t>5.</w:t>
               <w:tab/>
             </w:r>
             <w:r>
@@ -4372,6 +4661,34 @@
               <w:end w:w="80" w:type="dxa"/>
             </w:tcMar>
           </w:tcPr>
+          <w:p>
+            <w:pPr>
+              <w:tabs>
+                <w:tab w:pos="220" w:val="left"/>
+              </w:tabs>
+              <w:spacing w:before="0" w:after="40" w:line="240" w:lineRule="auto"/>
+              <w:ind w:left="220" w:hanging="220"/>
+            </w:pPr>
+            <w:r>
+              <w:rPr>
+                <w:rFonts w:ascii="Arial" w:hAnsi="Arial" w:eastAsia="Arial"/>
+                <w:b w:val="0"/>
+                <w:i w:val="0"/>
+                <w:sz w:val="18"/>
+              </w:rPr>
+              <w:t>•</w:t>
+              <w:tab/>
+            </w:r>
+            <w:r>
+              <w:rPr>
+                <w:rFonts w:ascii="Arial" w:hAnsi="Arial" w:eastAsia="Arial"/>
+                <w:b w:val="0"/>
+                <w:i w:val="0"/>
+                <w:sz w:val="18"/>
+              </w:rPr>
+              <w:t>LSGH Math 7 SimBook – Lesson 2</w:t>
+            </w:r>
+          </w:p>
           <w:p>
             <w:pPr>
               <w:tabs>
@@ -5043,6 +5360,44 @@
             <w:r>
               <w:rPr>
                 <w:rFonts w:ascii="Arial" w:hAnsi="Arial" w:eastAsia="Arial"/>
+                <w:b/>
+                <w:i w:val="0"/>
+                <w:color w:val="38761D"/>
+                <w:sz w:val="18"/>
+              </w:rPr>
+              <w:t>SIM LAB:</w:t>
+            </w:r>
+            <w:r>
+              <w:rPr>
+                <w:rFonts w:ascii="Arial" w:hAnsi="Arial" w:eastAsia="Arial"/>
+                <w:b w:val="0"/>
+                <w:i w:val="0"/>
+                <w:sz w:val="18"/>
+              </w:rPr>
+              <w:t xml:space="preserve"> SimBook – Angle Sum Machine (Triangle Split, Turtle Walk, Honeycomb Test)</w:t>
+            </w:r>
+          </w:p>
+          <w:p>
+            <w:pPr>
+              <w:tabs>
+                <w:tab w:pos="220" w:val="left"/>
+              </w:tabs>
+              <w:spacing w:before="0" w:after="40" w:line="240" w:lineRule="auto"/>
+              <w:ind w:left="220" w:hanging="220"/>
+            </w:pPr>
+            <w:r>
+              <w:rPr>
+                <w:rFonts w:ascii="Arial" w:hAnsi="Arial" w:eastAsia="Arial"/>
+                <w:b w:val="0"/>
+                <w:i w:val="0"/>
+                <w:sz w:val="18"/>
+              </w:rPr>
+              <w:t>3.</w:t>
+              <w:tab/>
+            </w:r>
+            <w:r>
+              <w:rPr>
+                <w:rFonts w:ascii="Arial" w:hAnsi="Arial" w:eastAsia="Arial"/>
                 <w:b w:val="0"/>
                 <w:i w:val="0"/>
                 <w:sz w:val="18"/>
@@ -5065,7 +5420,7 @@
                 <w:i w:val="0"/>
                 <w:sz w:val="18"/>
               </w:rPr>
-              <w:t>3.</w:t>
+              <w:t>4.</w:t>
               <w:tab/>
             </w:r>
             <w:r>
@@ -5093,7 +5448,7 @@
                 <w:i w:val="0"/>
                 <w:sz w:val="18"/>
               </w:rPr>
-              <w:t>4.</w:t>
+              <w:t>5.</w:t>
               <w:tab/>
             </w:r>
             <w:r>
@@ -5117,6 +5472,34 @@
               <w:end w:w="80" w:type="dxa"/>
             </w:tcMar>
           </w:tcPr>
+          <w:p>
+            <w:pPr>
+              <w:tabs>
+                <w:tab w:pos="220" w:val="left"/>
+              </w:tabs>
+              <w:spacing w:before="0" w:after="40" w:line="240" w:lineRule="auto"/>
+              <w:ind w:left="220" w:hanging="220"/>
+            </w:pPr>
+            <w:r>
+              <w:rPr>
+                <w:rFonts w:ascii="Arial" w:hAnsi="Arial" w:eastAsia="Arial"/>
+                <w:b w:val="0"/>
+                <w:i w:val="0"/>
+                <w:sz w:val="18"/>
+              </w:rPr>
+              <w:t>•</w:t>
+              <w:tab/>
+            </w:r>
+            <w:r>
+              <w:rPr>
+                <w:rFonts w:ascii="Arial" w:hAnsi="Arial" w:eastAsia="Arial"/>
+                <w:b w:val="0"/>
+                <w:i w:val="0"/>
+                <w:sz w:val="18"/>
+              </w:rPr>
+              <w:t>LSGH Math 7 SimBook – Lesson 3</w:t>
+            </w:r>
+          </w:p>
           <w:p>
             <w:pPr>
               <w:tabs>
@@ -6154,6 +6537,44 @@
             <w:r>
               <w:rPr>
                 <w:rFonts w:ascii="Arial" w:hAnsi="Arial" w:eastAsia="Arial"/>
+                <w:b/>
+                <w:i w:val="0"/>
+                <w:color w:val="38761D"/>
+                <w:sz w:val="18"/>
+              </w:rPr>
+              <w:t>SIM LAB:</w:t>
+            </w:r>
+            <w:r>
+              <w:rPr>
+                <w:rFonts w:ascii="Arial" w:hAnsi="Arial" w:eastAsia="Arial"/>
+                <w:b w:val="0"/>
+                <w:i w:val="0"/>
+                <w:sz w:val="18"/>
+              </w:rPr>
+              <w:t xml:space="preserve"> SimBook – LSGH Mini Mall (Promo Lab, Price Change, Money Tools)</w:t>
+            </w:r>
+          </w:p>
+          <w:p>
+            <w:pPr>
+              <w:tabs>
+                <w:tab w:pos="220" w:val="left"/>
+              </w:tabs>
+              <w:spacing w:before="0" w:after="40" w:line="240" w:lineRule="auto"/>
+              <w:ind w:left="220" w:hanging="220"/>
+            </w:pPr>
+            <w:r>
+              <w:rPr>
+                <w:rFonts w:ascii="Arial" w:hAnsi="Arial" w:eastAsia="Arial"/>
+                <w:b w:val="0"/>
+                <w:i w:val="0"/>
+                <w:sz w:val="18"/>
+              </w:rPr>
+              <w:t>3.</w:t>
+              <w:tab/>
+            </w:r>
+            <w:r>
+              <w:rPr>
+                <w:rFonts w:ascii="Arial" w:hAnsi="Arial" w:eastAsia="Arial"/>
                 <w:b w:val="0"/>
                 <w:i w:val="0"/>
                 <w:sz w:val="18"/>
@@ -6176,7 +6597,7 @@
                 <w:i w:val="0"/>
                 <w:sz w:val="18"/>
               </w:rPr>
-              <w:t>3.</w:t>
+              <w:t>4.</w:t>
               <w:tab/>
             </w:r>
             <w:r>
@@ -6204,7 +6625,7 @@
                 <w:i w:val="0"/>
                 <w:sz w:val="18"/>
               </w:rPr>
-              <w:t>4.</w:t>
+              <w:t>5.</w:t>
               <w:tab/>
             </w:r>
             <w:r>
@@ -6232,7 +6653,7 @@
                 <w:i w:val="0"/>
                 <w:sz w:val="18"/>
               </w:rPr>
-              <w:t>5.</w:t>
+              <w:t>6.</w:t>
               <w:tab/>
             </w:r>
             <w:r>
@@ -6256,6 +6677,34 @@
               <w:end w:w="80" w:type="dxa"/>
             </w:tcMar>
           </w:tcPr>
+          <w:p>
+            <w:pPr>
+              <w:tabs>
+                <w:tab w:pos="220" w:val="left"/>
+              </w:tabs>
+              <w:spacing w:before="0" w:after="40" w:line="240" w:lineRule="auto"/>
+              <w:ind w:left="220" w:hanging="220"/>
+            </w:pPr>
+            <w:r>
+              <w:rPr>
+                <w:rFonts w:ascii="Arial" w:hAnsi="Arial" w:eastAsia="Arial"/>
+                <w:b w:val="0"/>
+                <w:i w:val="0"/>
+                <w:sz w:val="18"/>
+              </w:rPr>
+              <w:t>•</w:t>
+              <w:tab/>
+            </w:r>
+            <w:r>
+              <w:rPr>
+                <w:rFonts w:ascii="Arial" w:hAnsi="Arial" w:eastAsia="Arial"/>
+                <w:b w:val="0"/>
+                <w:i w:val="0"/>
+                <w:sz w:val="18"/>
+              </w:rPr>
+              <w:t>LSGH Math 7 SimBook – Lesson 4</w:t>
+            </w:r>
+          </w:p>
           <w:p>
             <w:pPr>
               <w:tabs>
@@ -6908,6 +7357,44 @@
             <w:r>
               <w:rPr>
                 <w:rFonts w:ascii="Arial" w:hAnsi="Arial" w:eastAsia="Arial"/>
+                <w:b/>
+                <w:i w:val="0"/>
+                <w:color w:val="38761D"/>
+                <w:sz w:val="18"/>
+              </w:rPr>
+              <w:t>SIM LAB:</w:t>
+            </w:r>
+            <w:r>
+              <w:rPr>
+                <w:rFonts w:ascii="Arial" w:hAnsi="Arial" w:eastAsia="Arial"/>
+                <w:b w:val="0"/>
+                <w:i w:val="0"/>
+                <w:sz w:val="18"/>
+              </w:rPr>
+              <w:t xml:space="preserve"> SimBook – Baon Life Sim (Plan, Live the Week, Savings Goal)</w:t>
+            </w:r>
+          </w:p>
+          <w:p>
+            <w:pPr>
+              <w:tabs>
+                <w:tab w:pos="220" w:val="left"/>
+              </w:tabs>
+              <w:spacing w:before="0" w:after="40" w:line="240" w:lineRule="auto"/>
+              <w:ind w:left="220" w:hanging="220"/>
+            </w:pPr>
+            <w:r>
+              <w:rPr>
+                <w:rFonts w:ascii="Arial" w:hAnsi="Arial" w:eastAsia="Arial"/>
+                <w:b w:val="0"/>
+                <w:i w:val="0"/>
+                <w:sz w:val="18"/>
+              </w:rPr>
+              <w:t>3.</w:t>
+              <w:tab/>
+            </w:r>
+            <w:r>
+              <w:rPr>
+                <w:rFonts w:ascii="Arial" w:hAnsi="Arial" w:eastAsia="Arial"/>
                 <w:b w:val="0"/>
                 <w:i w:val="0"/>
                 <w:sz w:val="18"/>
@@ -6930,7 +7417,7 @@
                 <w:i w:val="0"/>
                 <w:sz w:val="18"/>
               </w:rPr>
-              <w:t>3.</w:t>
+              <w:t>4.</w:t>
               <w:tab/>
             </w:r>
             <w:r>
@@ -6958,7 +7445,7 @@
                 <w:i w:val="0"/>
                 <w:sz w:val="18"/>
               </w:rPr>
-              <w:t>4.</w:t>
+              <w:t>5.</w:t>
               <w:tab/>
             </w:r>
             <w:r>
@@ -6983,6 +7470,34 @@
             </w:tcMar>
             <w:shd w:val="clear" w:color="auto" w:fill="D0E0E3"/>
           </w:tcPr>
+          <w:p>
+            <w:pPr>
+              <w:tabs>
+                <w:tab w:pos="220" w:val="left"/>
+              </w:tabs>
+              <w:spacing w:before="0" w:after="40" w:line="240" w:lineRule="auto"/>
+              <w:ind w:left="220" w:hanging="220"/>
+            </w:pPr>
+            <w:r>
+              <w:rPr>
+                <w:rFonts w:ascii="Arial" w:hAnsi="Arial" w:eastAsia="Arial"/>
+                <w:b w:val="0"/>
+                <w:i w:val="0"/>
+                <w:sz w:val="18"/>
+              </w:rPr>
+              <w:t>•</w:t>
+              <w:tab/>
+            </w:r>
+            <w:r>
+              <w:rPr>
+                <w:rFonts w:ascii="Arial" w:hAnsi="Arial" w:eastAsia="Arial"/>
+                <w:b w:val="0"/>
+                <w:i w:val="0"/>
+                <w:sz w:val="18"/>
+              </w:rPr>
+              <w:t>LSGH Math 7 SimBook – Lesson 5</w:t>
+            </w:r>
+          </w:p>
           <w:p>
             <w:pPr>
               <w:tabs>
@@ -7636,6 +8151,44 @@
             <w:r>
               <w:rPr>
                 <w:rFonts w:ascii="Arial" w:hAnsi="Arial" w:eastAsia="Arial"/>
+                <w:b/>
+                <w:i w:val="0"/>
+                <w:color w:val="38761D"/>
+                <w:sz w:val="18"/>
+              </w:rPr>
+              <w:t>SIM LAB:</w:t>
+            </w:r>
+            <w:r>
+              <w:rPr>
+                <w:rFonts w:ascii="Arial" w:hAnsi="Arial" w:eastAsia="Arial"/>
+                <w:b w:val="0"/>
+                <w:i w:val="0"/>
+                <w:sz w:val="18"/>
+              </w:rPr>
+              <w:t xml:space="preserve"> SimBook – Rate Racer (Race, Best Buy)</w:t>
+            </w:r>
+          </w:p>
+          <w:p>
+            <w:pPr>
+              <w:tabs>
+                <w:tab w:pos="220" w:val="left"/>
+              </w:tabs>
+              <w:spacing w:before="0" w:after="40" w:line="240" w:lineRule="auto"/>
+              <w:ind w:left="220" w:hanging="220"/>
+            </w:pPr>
+            <w:r>
+              <w:rPr>
+                <w:rFonts w:ascii="Arial" w:hAnsi="Arial" w:eastAsia="Arial"/>
+                <w:b w:val="0"/>
+                <w:i w:val="0"/>
+                <w:sz w:val="18"/>
+              </w:rPr>
+              <w:t>3.</w:t>
+              <w:tab/>
+            </w:r>
+            <w:r>
+              <w:rPr>
+                <w:rFonts w:ascii="Arial" w:hAnsi="Arial" w:eastAsia="Arial"/>
                 <w:b w:val="0"/>
                 <w:i w:val="0"/>
                 <w:sz w:val="18"/>
@@ -7658,7 +8211,7 @@
                 <w:i w:val="0"/>
                 <w:sz w:val="18"/>
               </w:rPr>
-              <w:t>3.</w:t>
+              <w:t>4.</w:t>
               <w:tab/>
             </w:r>
             <w:r>
@@ -7686,7 +8239,7 @@
                 <w:i w:val="0"/>
                 <w:sz w:val="18"/>
               </w:rPr>
-              <w:t>4.</w:t>
+              <w:t>5.</w:t>
               <w:tab/>
             </w:r>
             <w:r>
@@ -7710,6 +8263,34 @@
               <w:end w:w="80" w:type="dxa"/>
             </w:tcMar>
           </w:tcPr>
+          <w:p>
+            <w:pPr>
+              <w:tabs>
+                <w:tab w:pos="220" w:val="left"/>
+              </w:tabs>
+              <w:spacing w:before="0" w:after="40" w:line="240" w:lineRule="auto"/>
+              <w:ind w:left="220" w:hanging="220"/>
+            </w:pPr>
+            <w:r>
+              <w:rPr>
+                <w:rFonts w:ascii="Arial" w:hAnsi="Arial" w:eastAsia="Arial"/>
+                <w:b w:val="0"/>
+                <w:i w:val="0"/>
+                <w:sz w:val="18"/>
+              </w:rPr>
+              <w:t>•</w:t>
+              <w:tab/>
+            </w:r>
+            <w:r>
+              <w:rPr>
+                <w:rFonts w:ascii="Arial" w:hAnsi="Arial" w:eastAsia="Arial"/>
+                <w:b w:val="0"/>
+                <w:i w:val="0"/>
+                <w:sz w:val="18"/>
+              </w:rPr>
+              <w:t>LSGH Math 7 SimBook – Lesson 6</w:t>
+            </w:r>
+          </w:p>
           <w:p>
             <w:pPr>
               <w:tabs>
@@ -8686,6 +9267,44 @@
             <w:r>
               <w:rPr>
                 <w:rFonts w:ascii="Arial" w:hAnsi="Arial" w:eastAsia="Arial"/>
+                <w:b/>
+                <w:i w:val="0"/>
+                <w:color w:val="38761D"/>
+                <w:sz w:val="18"/>
+              </w:rPr>
+              <w:t>SIM LAB:</w:t>
+            </w:r>
+            <w:r>
+              <w:rPr>
+                <w:rFonts w:ascii="Arial" w:hAnsi="Arial" w:eastAsia="Arial"/>
+                <w:b w:val="0"/>
+                <w:i w:val="0"/>
+                <w:sz w:val="18"/>
+              </w:rPr>
+              <w:t xml:space="preserve"> SimBook – Number Line Explorer (Converter, Order It, Zoom Between)</w:t>
+            </w:r>
+          </w:p>
+          <w:p>
+            <w:pPr>
+              <w:tabs>
+                <w:tab w:pos="220" w:val="left"/>
+              </w:tabs>
+              <w:spacing w:before="0" w:after="40" w:line="240" w:lineRule="auto"/>
+              <w:ind w:left="220" w:hanging="220"/>
+            </w:pPr>
+            <w:r>
+              <w:rPr>
+                <w:rFonts w:ascii="Arial" w:hAnsi="Arial" w:eastAsia="Arial"/>
+                <w:b w:val="0"/>
+                <w:i w:val="0"/>
+                <w:sz w:val="18"/>
+              </w:rPr>
+              <w:t>3.</w:t>
+              <w:tab/>
+            </w:r>
+            <w:r>
+              <w:rPr>
+                <w:rFonts w:ascii="Arial" w:hAnsi="Arial" w:eastAsia="Arial"/>
                 <w:b w:val="0"/>
                 <w:i w:val="0"/>
                 <w:sz w:val="18"/>
@@ -8708,7 +9327,7 @@
                 <w:i w:val="0"/>
                 <w:sz w:val="18"/>
               </w:rPr>
-              <w:t>3.</w:t>
+              <w:t>4.</w:t>
               <w:tab/>
             </w:r>
             <w:r>
@@ -8736,7 +9355,7 @@
                 <w:i w:val="0"/>
                 <w:sz w:val="18"/>
               </w:rPr>
-              <w:t>4.</w:t>
+              <w:t>5.</w:t>
               <w:tab/>
             </w:r>
             <w:r>
@@ -8760,6 +9379,34 @@
               <w:end w:w="80" w:type="dxa"/>
             </w:tcMar>
           </w:tcPr>
+          <w:p>
+            <w:pPr>
+              <w:tabs>
+                <w:tab w:pos="220" w:val="left"/>
+              </w:tabs>
+              <w:spacing w:before="0" w:after="40" w:line="240" w:lineRule="auto"/>
+              <w:ind w:left="220" w:hanging="220"/>
+            </w:pPr>
+            <w:r>
+              <w:rPr>
+                <w:rFonts w:ascii="Arial" w:hAnsi="Arial" w:eastAsia="Arial"/>
+                <w:b w:val="0"/>
+                <w:i w:val="0"/>
+                <w:sz w:val="18"/>
+              </w:rPr>
+              <w:t>•</w:t>
+              <w:tab/>
+            </w:r>
+            <w:r>
+              <w:rPr>
+                <w:rFonts w:ascii="Arial" w:hAnsi="Arial" w:eastAsia="Arial"/>
+                <w:b w:val="0"/>
+                <w:i w:val="0"/>
+                <w:sz w:val="18"/>
+              </w:rPr>
+              <w:t>LSGH Math 7 SimBook – Lesson 7</w:t>
+            </w:r>
+          </w:p>
           <w:p>
             <w:pPr>
               <w:tabs>
@@ -9406,6 +10053,44 @@
             <w:r>
               <w:rPr>
                 <w:rFonts w:ascii="Arial" w:hAnsi="Arial" w:eastAsia="Arial"/>
+                <w:b/>
+                <w:i w:val="0"/>
+                <w:color w:val="38761D"/>
+                <w:sz w:val="18"/>
+              </w:rPr>
+              <w:t>SIM LAB:</w:t>
+            </w:r>
+            <w:r>
+              <w:rPr>
+                <w:rFonts w:ascii="Arial" w:hAnsi="Arial" w:eastAsia="Arial"/>
+                <w:b w:val="0"/>
+                <w:i w:val="0"/>
+                <w:sz w:val="18"/>
+              </w:rPr>
+              <w:t xml:space="preserve"> SimBook – Fraction Kitchen (Fraction Bars, Kakanin Kitchen, Decimal Grid)</w:t>
+            </w:r>
+          </w:p>
+          <w:p>
+            <w:pPr>
+              <w:tabs>
+                <w:tab w:pos="220" w:val="left"/>
+              </w:tabs>
+              <w:spacing w:before="0" w:after="40" w:line="240" w:lineRule="auto"/>
+              <w:ind w:left="220" w:hanging="220"/>
+            </w:pPr>
+            <w:r>
+              <w:rPr>
+                <w:rFonts w:ascii="Arial" w:hAnsi="Arial" w:eastAsia="Arial"/>
+                <w:b w:val="0"/>
+                <w:i w:val="0"/>
+                <w:sz w:val="18"/>
+              </w:rPr>
+              <w:t>3.</w:t>
+              <w:tab/>
+            </w:r>
+            <w:r>
+              <w:rPr>
+                <w:rFonts w:ascii="Arial" w:hAnsi="Arial" w:eastAsia="Arial"/>
                 <w:b w:val="0"/>
                 <w:i w:val="0"/>
                 <w:sz w:val="18"/>
@@ -9428,7 +10113,7 @@
                 <w:i w:val="0"/>
                 <w:sz w:val="18"/>
               </w:rPr>
-              <w:t>3.</w:t>
+              <w:t>4.</w:t>
               <w:tab/>
             </w:r>
             <w:r>
@@ -9456,7 +10141,7 @@
                 <w:i w:val="0"/>
                 <w:sz w:val="18"/>
               </w:rPr>
-              <w:t>4.</w:t>
+              <w:t>5.</w:t>
               <w:tab/>
             </w:r>
             <w:r>
@@ -9484,7 +10169,7 @@
                 <w:i w:val="0"/>
                 <w:sz w:val="18"/>
               </w:rPr>
-              <w:t>5.</w:t>
+              <w:t>6.</w:t>
               <w:tab/>
             </w:r>
             <w:r>
@@ -9508,6 +10193,34 @@
               <w:end w:w="80" w:type="dxa"/>
             </w:tcMar>
           </w:tcPr>
+          <w:p>
+            <w:pPr>
+              <w:tabs>
+                <w:tab w:pos="220" w:val="left"/>
+              </w:tabs>
+              <w:spacing w:before="0" w:after="40" w:line="240" w:lineRule="auto"/>
+              <w:ind w:left="220" w:hanging="220"/>
+            </w:pPr>
+            <w:r>
+              <w:rPr>
+                <w:rFonts w:ascii="Arial" w:hAnsi="Arial" w:eastAsia="Arial"/>
+                <w:b w:val="0"/>
+                <w:i w:val="0"/>
+                <w:sz w:val="18"/>
+              </w:rPr>
+              <w:t>•</w:t>
+              <w:tab/>
+            </w:r>
+            <w:r>
+              <w:rPr>
+                <w:rFonts w:ascii="Arial" w:hAnsi="Arial" w:eastAsia="Arial"/>
+                <w:b w:val="0"/>
+                <w:i w:val="0"/>
+                <w:sz w:val="18"/>
+              </w:rPr>
+              <w:t>LSGH Math 7 SimBook – Lesson 8</w:t>
+            </w:r>
+          </w:p>
           <w:p>
             <w:pPr>
               <w:tabs>
@@ -10155,6 +10868,44 @@
             <w:r>
               <w:rPr>
                 <w:rFonts w:ascii="Arial" w:hAnsi="Arial" w:eastAsia="Arial"/>
+                <w:b/>
+                <w:i w:val="0"/>
+                <w:color w:val="38761D"/>
+                <w:sz w:val="18"/>
+              </w:rPr>
+              <w:t>SIM LAB:</w:t>
+            </w:r>
+            <w:r>
+              <w:rPr>
+                <w:rFonts w:ascii="Arial" w:hAnsi="Arial" w:eastAsia="Arial"/>
+                <w:b w:val="0"/>
+                <w:i w:val="0"/>
+                <w:sz w:val="18"/>
+              </w:rPr>
+              <w:t xml:space="preserve"> SimBook – Roots Lab (Square and Cube Builders, Root Estimator, Square of Area 2)</w:t>
+            </w:r>
+          </w:p>
+          <w:p>
+            <w:pPr>
+              <w:tabs>
+                <w:tab w:pos="220" w:val="left"/>
+              </w:tabs>
+              <w:spacing w:before="0" w:after="40" w:line="240" w:lineRule="auto"/>
+              <w:ind w:left="220" w:hanging="220"/>
+            </w:pPr>
+            <w:r>
+              <w:rPr>
+                <w:rFonts w:ascii="Arial" w:hAnsi="Arial" w:eastAsia="Arial"/>
+                <w:b w:val="0"/>
+                <w:i w:val="0"/>
+                <w:sz w:val="18"/>
+              </w:rPr>
+              <w:t>3.</w:t>
+              <w:tab/>
+            </w:r>
+            <w:r>
+              <w:rPr>
+                <w:rFonts w:ascii="Arial" w:hAnsi="Arial" w:eastAsia="Arial"/>
                 <w:b w:val="0"/>
                 <w:i w:val="0"/>
                 <w:sz w:val="18"/>
@@ -10177,7 +10928,7 @@
                 <w:i w:val="0"/>
                 <w:sz w:val="18"/>
               </w:rPr>
-              <w:t>3.</w:t>
+              <w:t>4.</w:t>
               <w:tab/>
             </w:r>
             <w:r>
@@ -10205,7 +10956,7 @@
                 <w:i w:val="0"/>
                 <w:sz w:val="18"/>
               </w:rPr>
-              <w:t>4.</w:t>
+              <w:t>5.</w:t>
               <w:tab/>
             </w:r>
             <w:r>
@@ -10229,6 +10980,34 @@
               <w:end w:w="80" w:type="dxa"/>
             </w:tcMar>
           </w:tcPr>
+          <w:p>
+            <w:pPr>
+              <w:tabs>
+                <w:tab w:pos="220" w:val="left"/>
+              </w:tabs>
+              <w:spacing w:before="0" w:after="40" w:line="240" w:lineRule="auto"/>
+              <w:ind w:left="220" w:hanging="220"/>
+            </w:pPr>
+            <w:r>
+              <w:rPr>
+                <w:rFonts w:ascii="Arial" w:hAnsi="Arial" w:eastAsia="Arial"/>
+                <w:b w:val="0"/>
+                <w:i w:val="0"/>
+                <w:sz w:val="18"/>
+              </w:rPr>
+              <w:t>•</w:t>
+              <w:tab/>
+            </w:r>
+            <w:r>
+              <w:rPr>
+                <w:rFonts w:ascii="Arial" w:hAnsi="Arial" w:eastAsia="Arial"/>
+                <w:b w:val="0"/>
+                <w:i w:val="0"/>
+                <w:sz w:val="18"/>
+              </w:rPr>
+              <w:t>LSGH Math 7 SimBook – Lesson 9</w:t>
+            </w:r>
+          </w:p>
           <w:p>
             <w:pPr>
               <w:tabs>

</xml_diff>

<commit_message>
Add traditional lessons and exercise sets to the SimBook; sims become hooks
- Each lesson page: Hook (sim) -> Lesson (definitions, rules, worked examples)
  -> Check Yourself -> Exercises (14 numbered items in Parts A-C with checking,
  worked solutions, and an answer key)
- LG: sim cards relabelled SIM HOOK, teacher-led discussion wording restored,
  SimBook Exercises listed as seatwork and homework
- CM: SimBook resources list the hook, lesson, and exercises

Co-Authored-By: Claude Opus 5.5 <noreply@anthropic.com>
Claude-Session: https://claude.ai/code/session_017G5QYgrCTCFugkQCNFUaXc
</commit_message>
<xml_diff>
--- a/output/grade7/Grade7-CM-1st_Trim-SY2026-2027-Mathematics.docx
+++ b/output/grade7/Grade7-CM-1st_Trim-SY2026-2027-Mathematics.docx
@@ -3781,7 +3781,7 @@
                 <w:color w:val="38761D"/>
                 <w:sz w:val="18"/>
               </w:rPr>
-              <w:t>SIM LAB:</w:t>
+              <w:t>SIM HOOK:</w:t>
             </w:r>
             <w:r>
               <w:rPr>
@@ -3913,7 +3913,7 @@
                 <w:i w:val="0"/>
                 <w:sz w:val="18"/>
               </w:rPr>
-              <w:t>LSGH Math 7 SimBook – Lesson 1</w:t>
+              <w:t>LSGH Math 7 SimBook – Lesson 1 (hook, lesson, and Exercises 1)</w:t>
             </w:r>
           </w:p>
           <w:p>
@@ -4554,7 +4554,7 @@
                 <w:color w:val="38761D"/>
                 <w:sz w:val="18"/>
               </w:rPr>
-              <w:t>SIM LAB:</w:t>
+              <w:t>SIM HOOK:</w:t>
             </w:r>
             <w:r>
               <w:rPr>
@@ -4686,7 +4686,7 @@
                 <w:i w:val="0"/>
                 <w:sz w:val="18"/>
               </w:rPr>
-              <w:t>LSGH Math 7 SimBook – Lesson 2</w:t>
+              <w:t>LSGH Math 7 SimBook – Lesson 2 (hook, lesson, and Exercises 2)</w:t>
             </w:r>
           </w:p>
           <w:p>
@@ -5365,7 +5365,7 @@
                 <w:color w:val="38761D"/>
                 <w:sz w:val="18"/>
               </w:rPr>
-              <w:t>SIM LAB:</w:t>
+              <w:t>SIM HOOK:</w:t>
             </w:r>
             <w:r>
               <w:rPr>
@@ -5497,7 +5497,7 @@
                 <w:i w:val="0"/>
                 <w:sz w:val="18"/>
               </w:rPr>
-              <w:t>LSGH Math 7 SimBook – Lesson 3</w:t>
+              <w:t>LSGH Math 7 SimBook – Lesson 3 (hook, lesson, and Exercises 3)</w:t>
             </w:r>
           </w:p>
           <w:p>
@@ -6542,7 +6542,7 @@
                 <w:color w:val="38761D"/>
                 <w:sz w:val="18"/>
               </w:rPr>
-              <w:t>SIM LAB:</w:t>
+              <w:t>SIM HOOK:</w:t>
             </w:r>
             <w:r>
               <w:rPr>
@@ -6702,7 +6702,7 @@
                 <w:i w:val="0"/>
                 <w:sz w:val="18"/>
               </w:rPr>
-              <w:t>LSGH Math 7 SimBook – Lesson 4</w:t>
+              <w:t>LSGH Math 7 SimBook – Lesson 4 (hook, lesson, and Exercises 4)</w:t>
             </w:r>
           </w:p>
           <w:p>
@@ -7362,7 +7362,7 @@
                 <w:color w:val="38761D"/>
                 <w:sz w:val="18"/>
               </w:rPr>
-              <w:t>SIM LAB:</w:t>
+              <w:t>SIM HOOK:</w:t>
             </w:r>
             <w:r>
               <w:rPr>
@@ -7495,7 +7495,7 @@
                 <w:i w:val="0"/>
                 <w:sz w:val="18"/>
               </w:rPr>
-              <w:t>LSGH Math 7 SimBook – Lesson 5</w:t>
+              <w:t>LSGH Math 7 SimBook – Lesson 5 (hook, lesson, and Exercises 5)</w:t>
             </w:r>
           </w:p>
           <w:p>
@@ -8156,7 +8156,7 @@
                 <w:color w:val="38761D"/>
                 <w:sz w:val="18"/>
               </w:rPr>
-              <w:t>SIM LAB:</w:t>
+              <w:t>SIM HOOK:</w:t>
             </w:r>
             <w:r>
               <w:rPr>
@@ -8288,7 +8288,7 @@
                 <w:i w:val="0"/>
                 <w:sz w:val="18"/>
               </w:rPr>
-              <w:t>LSGH Math 7 SimBook – Lesson 6</w:t>
+              <w:t>LSGH Math 7 SimBook – Lesson 6 (hook, lesson, and Exercises 6)</w:t>
             </w:r>
           </w:p>
           <w:p>
@@ -9272,7 +9272,7 @@
                 <w:color w:val="38761D"/>
                 <w:sz w:val="18"/>
               </w:rPr>
-              <w:t>SIM LAB:</w:t>
+              <w:t>SIM HOOK:</w:t>
             </w:r>
             <w:r>
               <w:rPr>
@@ -9404,7 +9404,7 @@
                 <w:i w:val="0"/>
                 <w:sz w:val="18"/>
               </w:rPr>
-              <w:t>LSGH Math 7 SimBook – Lesson 7</w:t>
+              <w:t>LSGH Math 7 SimBook – Lesson 7 (hook, lesson, and Exercises 7)</w:t>
             </w:r>
           </w:p>
           <w:p>
@@ -10058,7 +10058,7 @@
                 <w:color w:val="38761D"/>
                 <w:sz w:val="18"/>
               </w:rPr>
-              <w:t>SIM LAB:</w:t>
+              <w:t>SIM HOOK:</w:t>
             </w:r>
             <w:r>
               <w:rPr>
@@ -10218,7 +10218,7 @@
                 <w:i w:val="0"/>
                 <w:sz w:val="18"/>
               </w:rPr>
-              <w:t>LSGH Math 7 SimBook – Lesson 8</w:t>
+              <w:t>LSGH Math 7 SimBook – Lesson 8 (hook, lesson, and Exercises 8)</w:t>
             </w:r>
           </w:p>
           <w:p>
@@ -10873,7 +10873,7 @@
                 <w:color w:val="38761D"/>
                 <w:sz w:val="18"/>
               </w:rPr>
-              <w:t>SIM LAB:</w:t>
+              <w:t>SIM HOOK:</w:t>
             </w:r>
             <w:r>
               <w:rPr>
@@ -11005,7 +11005,7 @@
                 <w:i w:val="0"/>
                 <w:sz w:val="18"/>
               </w:rPr>
-              <w:t>LSGH Math 7 SimBook – Lesson 9</w:t>
+              <w:t>LSGH Math 7 SimBook – Lesson 9 (hook, lesson, and Exercises 9)</w:t>
             </w:r>
           </w:p>
           <w:p>

</xml_diff>

<commit_message>
Present SimBook lessons as slide decks with speaker notes
- deck.js: 16:9 slides generated from each lesson, with step-by-step builds,
  keyboard and click navigation, slide overview, Present mode, and auto-fit
- Notes panel holds explanations, full solutions, and teaching prompts
- LG and CM resources list the lesson slides

Co-Authored-By: Claude Opus 5.5 <noreply@anthropic.com>
Claude-Session: https://claude.ai/code/session_017G5QYgrCTCFugkQCNFUaXc
</commit_message>
<xml_diff>
--- a/output/grade7/Grade7-CM-1st_Trim-SY2026-2027-Mathematics.docx
+++ b/output/grade7/Grade7-CM-1st_Trim-SY2026-2027-Mathematics.docx
@@ -3913,7 +3913,7 @@
                 <w:i w:val="0"/>
                 <w:sz w:val="18"/>
               </w:rPr>
-              <w:t>LSGH Math 7 SimBook – Lesson 1 (hook, lesson, and Exercises 1)</w:t>
+              <w:t>LSGH Math 7 SimBook – Lesson 1 (hook sim, lesson slides with notes, and Exercises 1)</w:t>
             </w:r>
           </w:p>
           <w:p>
@@ -4686,7 +4686,7 @@
                 <w:i w:val="0"/>
                 <w:sz w:val="18"/>
               </w:rPr>
-              <w:t>LSGH Math 7 SimBook – Lesson 2 (hook, lesson, and Exercises 2)</w:t>
+              <w:t>LSGH Math 7 SimBook – Lesson 2 (hook sim, lesson slides with notes, and Exercises 2)</w:t>
             </w:r>
           </w:p>
           <w:p>
@@ -5497,7 +5497,7 @@
                 <w:i w:val="0"/>
                 <w:sz w:val="18"/>
               </w:rPr>
-              <w:t>LSGH Math 7 SimBook – Lesson 3 (hook, lesson, and Exercises 3)</w:t>
+              <w:t>LSGH Math 7 SimBook – Lesson 3 (hook sim, lesson slides with notes, and Exercises 3)</w:t>
             </w:r>
           </w:p>
           <w:p>
@@ -6702,7 +6702,7 @@
                 <w:i w:val="0"/>
                 <w:sz w:val="18"/>
               </w:rPr>
-              <w:t>LSGH Math 7 SimBook – Lesson 4 (hook, lesson, and Exercises 4)</w:t>
+              <w:t>LSGH Math 7 SimBook – Lesson 4 (hook sim, lesson slides with notes, and Exercises 4)</w:t>
             </w:r>
           </w:p>
           <w:p>
@@ -7495,7 +7495,7 @@
                 <w:i w:val="0"/>
                 <w:sz w:val="18"/>
               </w:rPr>
-              <w:t>LSGH Math 7 SimBook – Lesson 5 (hook, lesson, and Exercises 5)</w:t>
+              <w:t>LSGH Math 7 SimBook – Lesson 5 (hook sim, lesson slides with notes, and Exercises 5)</w:t>
             </w:r>
           </w:p>
           <w:p>
@@ -8288,7 +8288,7 @@
                 <w:i w:val="0"/>
                 <w:sz w:val="18"/>
               </w:rPr>
-              <w:t>LSGH Math 7 SimBook – Lesson 6 (hook, lesson, and Exercises 6)</w:t>
+              <w:t>LSGH Math 7 SimBook – Lesson 6 (hook sim, lesson slides with notes, and Exercises 6)</w:t>
             </w:r>
           </w:p>
           <w:p>
@@ -9404,7 +9404,7 @@
                 <w:i w:val="0"/>
                 <w:sz w:val="18"/>
               </w:rPr>
-              <w:t>LSGH Math 7 SimBook – Lesson 7 (hook, lesson, and Exercises 7)</w:t>
+              <w:t>LSGH Math 7 SimBook – Lesson 7 (hook sim, lesson slides with notes, and Exercises 7)</w:t>
             </w:r>
           </w:p>
           <w:p>
@@ -10218,7 +10218,7 @@
                 <w:i w:val="0"/>
                 <w:sz w:val="18"/>
               </w:rPr>
-              <w:t>LSGH Math 7 SimBook – Lesson 8 (hook, lesson, and Exercises 8)</w:t>
+              <w:t>LSGH Math 7 SimBook – Lesson 8 (hook sim, lesson slides with notes, and Exercises 8)</w:t>
             </w:r>
           </w:p>
           <w:p>
@@ -11005,7 +11005,7 @@
                 <w:i w:val="0"/>
                 <w:sz w:val="18"/>
               </w:rPr>
-              <w:t>LSGH Math 7 SimBook – Lesson 9 (hook, lesson, and Exercises 9)</w:t>
+              <w:t>LSGH Math 7 SimBook – Lesson 9 (hook sim, lesson slides with notes, and Exercises 9)</w:t>
             </w:r>
           </w:p>
           <w:p>

</xml_diff>